<commit_message>
P8 revision v0.2: second correction pass (journal conventions, verifier residuals), four new figures (E229 A10), reading copy with previews, portal metadata
Co-Authored-By: Claude Fable 5.1 <noreply@anthropic.com>
</commit_message>
<xml_diff>
--- a/papers/P8_linguistic_fossils/revision_v0.2/P8_revision_v0.2.docx
+++ b/papers/P8_linguistic_fossils/revision_v0.2/P8_revision_v0.2.docx
@@ -71,7 +71,7 @@
         <w:pStyle w:val="OLtext"/>
       </w:pPr>
       <w:r>
-        <w:t>In the basic vocabulary of many Austronesian languages some forms cannot be assigned to a higher-level proto-form: either they have cognates only in a few close relatives, and so reconstruct at most to a low-level proto-language, or no cognate is known at all. Such residues have long attracted a particular reading. For three Philippine Negrito languages, Reid (1994) counted forms with no known cognate anywhere at 17 to 29 percent of a 539-item list and, after weighing lost inherited forms, radical sound change and coinage, preferred a non-Austronesian substratum as their source. For Sulawesi the reading has been attached above all to Makasar. Lexicostatistical counts have long shown Makasar, with Konjo and Selayar, as the most divergent part of the South Sulawesi group (Mills 1975:491; Sirk 1989:71); whether a substratum lies behind the divergence has been raised and left open (Bulbeck 1992); and Bulbeck, Pasqua and Di Lello (2000:103), citing a retention figure of 38 percent from Proto-Malayo-Polynesian, describe the remaining 62 percent of the basic vocabulary as open to investigation as borrowing from pre-Austronesian, possibly Toalean, languages.</w:t>
+        <w:t>In the basic vocabulary of many Austronesian languages some forms cannot be assigned to a higher-level proto-form: either they have cognates only in a few close relatives, and so reconstruct at most to a low-level proto-language, or no cognate is known at all. Such residues have long attracted a particular reading. For three Philippine Negrito languages, Reid (1994) counted forms with no known cognate anywhere at 17 to 29 percent of a 539-item list and, after weighing lost inherited forms, radical sound change and coinage, preferred a non-Austronesian substratum as their source. For Sulawesi the reading has been attached above all to Makasar. Lexicostatistical counts have long shown Makasar, with Konjo and Selayar, as the most divergent part of the South Sulawesi group (Mills 1975:491; Sirk 1989:71); whether a substratum lies behind the divergence has been raised and left open (Bulbeck 1992); and Bulbeck, Pasqua, and Di Lello (2000:103), citing a retention figure of 38 percent from Proto-Malayo-Polynesian, describe the remaining 62 percent of the basic vocabulary as open to investigation as borrowing from pre-Austronesian, possibly Toalean, languages.</w:t>
       </w:r>
     </w:p>
     <w:p>
@@ -79,7 +79,7 @@
         <w:pStyle w:val="OLtextindented"/>
       </w:pPr>
       <w:r>
-        <w:t>The Austronesian Basic Vocabulary Database (ABVD; Greenhill, Blust and Gray 2008), in its Cross-Linguistic Data Formats version (Forkel et al. 2018), records for every form of a 210-meaning list whether its editors have grouped it with forms in other lists under a cognate-set number. The forms left without a number are the operational residue of the comparative method as it has been applied within one database. As computational work on Austronesian lexical data has grown (Gray, Drummond and Greenhill 2009; List 2012; Forkel et al. 2018), that residue is easy to extract and tempting to interpret. This paper asks what it is. For six ABVD word lists from Sulawesi we ask three things: what the absence of a cognate-set number means in the two lists where the question matters most, Makasar and Tolaki; whether uncoded forms can be told apart from coded ones by their written shape and their meaning; and what, measurably, distinguishes them.</w:t>
+        <w:t>The Austronesian Basic Vocabulary Database (ABVD; Greenhill, Blust, and Gray 2008), in its Cross-Linguistic Data Formats (CLDF) version (Forkel et al. 2018), records for every form of a 210-meaning list whether its editors have grouped it with forms in other lists under a cognate-set number. The forms left without a number are the operational residue of the comparative method as it has been applied within one database. As computational work on Austronesian lexical data has grown (Gray, Drummond, and Greenhill 2009; List 2012; Forkel et al. 2018), that residue is easy to extract and tempting to interpret. This paper asks what it is. For six ABVD word lists from Sulawesi we ask three things: what the absence of a cognate-set number means in the two lists where the question matters most, Makasar and Tolaki; whether uncoded forms can be told apart from coded ones by their written shape and their meaning; and what, measurably, distinguishes them.</w:t>
       </w:r>
     </w:p>
     <w:p>
@@ -130,7 +130,7 @@
         <w:pStyle w:val="OLtextindented"/>
       </w:pPr>
       <w:r>
-        <w:t>The paper makes no claim about the origin of any form. Where an etymological judgement would be needed, none of the authors can supply it, and the paper says so. What stands in its place is a set of mechanical comparisons with explicit controls for chance: a classifier assessed on forms and on whole lists it has not seen; a look-alike screen whose sensitivity is measured on forms the database itself has coded; a permutation test whose decision rule was written before it was run. Each can be repeated from ABVD with the released scripts and files, and the limits of each are stated with its result. Section 2 describes the data, the label, the inputs and the tests; Section 3 gives the results in eight short parts; Section 4 discusses what they do and do not show; Section 5 concludes.</w:t>
+        <w:t>The paper makes no claim about the origin of any form. Where an etymological judgment would be needed, none of the authors can supply it, and the paper says so. What stands in its place is a set of mechanical comparisons with explicit controls for chance: a classifier assessed on forms and on whole lists it has not seen; a look-alike screen whose sensitivity is measured on forms the database itself has coded; a permutation test whose decision rule was written before it was run. Each can be repeated from ABVD with the released scripts and files, and the limits of each are stated with its result. Section 2 describes the data, the label, the inputs and the tests; section 3 gives the results in eight short parts; section 4 discusses what they do and do not show; section 5 concludes.</w:t>
       </w:r>
     </w:p>
     <w:p>
@@ -154,7 +154,7 @@
         <w:pStyle w:val="OLtext"/>
       </w:pPr>
       <w:r>
-        <w:t xml:space="preserve">The data are six word lists of the ABVD, in the lexibank/abvd CLDF release at repository state 917c5a5 (7 October 2025; licence CC BY 4.0): Muna (ABVD list 27; 219 forms; compiled from van den Berg), Bugis (48; 242 forms; Soppeng dialect, recopied from Zainuddin Taha with additions from Fachruddin Ambo Enre and Mills 1975), Makasar (166; 217 forms; Abd. Rajab), Wolio (192; 254 forms; J. C. Anceaux), Sa'dan Toraja (226; 216 forms; ABVD's list "Tae' (S. Toraja)", entered by Blust from van der Veen's dictionary of 1940) and Tolaki (674; 209 forms; Omar Abdullah Pidani; Konawe dialect). We use the spelling </w:t>
+        <w:t xml:space="preserve">The data are six word lists of the ABVD, in the lexibank/abvd CLDF release at repository state 917c5a5 (7 October 2025; license CC BY 4.0): Muna (ABVD list 27; 219 forms; compiled from van den Berg), Bugis (48; 242 forms; Soppeng dialect, recopied from Zainuddin Taha with additions from Fachruddin Ambo Enre and Mills 1975), Makasar (166; 217 forms; Abd. Rajab), Wolio (192; 254 forms; J. C. Anceaux), Sa'dan Toraja (226; 216 forms; ABVD's list "Tae' (S. Toraja)", entered by Blust from van der Veen's dictionary of 1940) and Tolaki (674; 209 forms; Omar Abdullah Pidani; Konawe dialect). We use the spelling </w:t>
       </w:r>
       <w:r>
         <w:rPr>
@@ -180,7 +180,7 @@
         <w:pStyle w:val="OLtextindented"/>
       </w:pPr>
       <w:r>
-        <w:t>ABVD's meaning list has 210 items. The six lists cover between 200 and 210 of them, and a meaning can have more than one form in a list: 117 of the 1,357 rows are a second or third form for their meaning. Every count in this paper is therefore a count of forms, with one exception noted in Section 2.6, where the Makasar comparison is made by meaning. The 210-item list is ABVD's own, and we do not call it a Swadesh list. For the computation of the inputs described in Section 2.3, bracketed additions by the compiler, leading and trailing punctuation and stray spaces were removed from the written form; the released files give the form exactly as ABVD records it.</w:t>
+        <w:t>ABVD's meaning list has 210 items. The six lists cover between 200 and 210 of them, and a meaning can have more than one form in a list: 117 of the 1,357 rows are a second or third form for their meaning. Every count in this paper is therefore a count of forms, with one exception noted in section 2.6, where the Makasar comparison is made by meaning. The 210-item list is ABVD's own, and we do not call it a Swadesh list. For the computation of the inputs described in section 2.3, bracketed additions by the compiler, leading and trailing punctuation and stray spaces were removed from the written form; the released files give the form exactly as ABVD records it.</w:t>
       </w:r>
     </w:p>
     <w:p>
@@ -310,7 +310,7 @@
         <w:t>tau</w:t>
       </w:r>
       <w:r>
-        <w:t>), and of the 142 forms flagged for a hyphen or a repeated block, 93 contain a hyphen (89 of them with no repeated block), almost all of them in the Bugis and Sa'dan Toraja lists, where the hyphen appears to mark a boundary set by the compiler. We therefore speak of an onset string, of a nasal input and of a hyphen-or-repetition input, and we test stricter versions of each in Section 3.5.</w:t>
+        <w:t>), and of the 142 forms flagged for a hyphen or a repeated block, 93 contain a hyphen (89 of them with no repeated block), almost all of them in the Bugis and Sa'dan Toraja lists, where the hyphen appears to mark a boundary set by the compiler. We therefore speak of an onset string, of a nasal input and of a hyphen-or-repetition input, and we test stricter versions of each in section 3.5.</w:t>
       </w:r>
     </w:p>
     <w:p>
@@ -334,7 +334,7 @@
         <w:pStyle w:val="OLtext"/>
       </w:pPr>
       <w:r>
-        <w:t>The main classifier is gradient-boosted decision trees (XGBoost; Chen and Guestrin 2016) with 300 trees of depth four and a learning rate of 0.05, trained without class weighting to separate uncoded from coded forms; the score it gives a form is its estimated probability of belonging to the uncoded class, so a higher score means a form that looks more like the uncoded forms. A random forest (Breiman 2001) and a logistic regression, both from scikit-learn (Pedregosa et al. 2011) and both with the two classes weighted equally, were run on the same inputs to see whether the ranking depends on the choice of method; the equal weighting is why their recall is higher and their accuracy lower in Table 3. The size of each input's contribution to the predictions is summarised by SHAP values (Lundberg and Lee 2017): each prediction is attributed to the inputs, and the mean of the absolute attributions over all forms is an input's average contribution, shown in Figure 1. Software: Python 3.11, scikit-learn 1.8.0, xgboost 3.0.3, shap 0.50.0.</w:t>
+        <w:t>The main classifier is gradient-boosted decision trees (XGBoost; Chen and Guestrin 2016) with 300 trees of depth four and a learning rate of 0.05, trained without class weighting to separate uncoded from coded forms; the score it gives a form is its estimated probability of belonging to the uncoded class, so a higher score means a form that looks more like the uncoded forms. A random forest (Breiman 2001) and a logistic regression, both from scikit-learn (Pedregosa et al. 2011) and both with the two classes weighted equally, were run on the same inputs to see whether the ranking depends on the choice of method; the equal weighting is why their recall is higher and their accuracy lower in table 3. The size of each input's contribution to the predictions is summarized by SHAP (Shapley additive explanations) values (Lundberg and Lee 2017): each prediction is attributed to the inputs, and the mean of the absolute attributions over all forms is an input's average contribution, shown in figure 1. Software: Python 3.11, scikit-learn 1.8.0, xgboost 3.0.3, shap 0.50.0.</w:t>
       </w:r>
     </w:p>
     <w:p>
@@ -350,7 +350,7 @@
         <w:pStyle w:val="OLtext"/>
       </w:pPr>
       <w:r>
-        <w:t>A classifier that is scored on the forms it was trained on will look better than it is. We therefore report two kinds of out-of-sample assessment. In cross-validation the 1,357 forms are divided at random into five parts of equal uncoded share; a model trained on four parts scores the fifth; this is done for every part, and the whole procedure is repeated ten times with different divisions, giving fifty test sets. In the held-out-list assessment the model is trained on five lists and scores the sixth, once for each list. The second assessment is what "generalises across Sulawesi languages" means concretely: a model that has never seen a Tolaki form is asked to rank the Tolaki forms.</w:t>
+        <w:t>A classifier that is scored on the forms it was trained on will look better than it is. We therefore report two kinds of out-of-sample assessment. In cross-validation the 1,357 forms are divided at random into five parts of equal uncoded share; a model trained on four parts scores the fifth; this is done for every part, and the whole procedure is repeated ten times with different divisions, giving fifty test sets. In the held-out-list assessment the model is trained on five lists and scores the sixth, once for each list. The second assessment is what "generalizes across Sulawesi languages" means concretely: a model that has never seen a Tolaki form is asked to rank the Tolaki forms.</w:t>
       </w:r>
     </w:p>
     <w:p>
@@ -358,7 +358,7 @@
         <w:pStyle w:val="OLtextindented"/>
       </w:pPr>
       <w:r>
-        <w:t>The main measure is the area under the receiver operating characteristic curve (AUC): the probability that a randomly chosen uncoded form receives a higher score than a randomly chosen coded form. A value of 0.5 is chance and 1.0 is perfect ranking. Verbal scales for the AUC exist (for instance Nahm 2022, Table 4, which calls 0.7 to 0.8 "fair" and 0.6 to 0.7 "poor"), but they are conventions without an empirical basis (White et al. 2023:2), and we report the numbers rather than the labels. We also report accuracy, the share of forms placed in the right class at a score threshold of 0.5, together with the accuracy of the trivial rule that calls every form coded (0.677), and the precision, recall and F1 score of the uncoded class. Two further baselines matter: a model given only the identity of the source list reaches an AUC of 0.680, and a model given only the eight meaning inputs reaches 0.646.</w:t>
+        <w:t>The main measure is the area under the receiver operating characteristic curve (AUC): the probability that a randomly chosen uncoded form receives a higher score than a randomly chosen coded form. A value of 0.5 is chance and 1.0 is perfect ranking. Verbal scales for the AUC exist (for instance Nahm 2022, table 4, which calls 0.7 to 0.8 "fair" and 0.6 to 0.7 "poor"), but they are conventions without an empirical basis (White et al. 2023:2), and we report the numbers rather than the labels. We also report accuracy, the share of forms placed in the right class at a score threshold of 0.5, together with the accuracy of the trivial rule that calls every form coded (0.677), and the precision, recall and F1 score of the uncoded class. Two further baselines matter: a model given only the identity of the source list reaches an AUC of 0.680, and a model given only the eight meaning inputs reaches 0.646.</w:t>
       </w:r>
     </w:p>
     <w:p>
@@ -400,7 +400,7 @@
         <w:t>Tolaki against its subgroup.</w:t>
       </w:r>
       <w:r>
-        <w:t xml:space="preserve"> Each Tolaki form is compared with the forms of the same meaning in ABVD's Proto-Bungku-Tolaki list (780) and in 42 other Bungku-Tolaki lists (41 of them contributed by one compiler, D. Mead; 13 languages by Glottolog code). The comparison is a look-alike screen: a normalised edit distance (Levenshtein 1966) between the written forms after bracketed material, hyphens, apostrophes and the glottal mark have been removed, computed so that up to three leading characters may be ignored on either side, with a match counted at a distance of 0.34 or less (a stricter run uses 0.25). The chance rate is the same comparison made against the forms of other meanings. The screen's sensitivity is measured on forms that ABVD itself places in a cognate set; because ABVD's coders and the screen both work from surface resemblance, that sensitivity is an upper bound on what the screen would find among cognates the coders missed. The same screen is applied to the uncoded Makasar forms, against the PMP entry and against the Bugis and Sa'dan Toraja forms of the same meaning. A look-alike is not a cognate judgement, and a distance of zero does not mean that two forms are identical. (c) </w:t>
+        <w:t xml:space="preserve"> Each Tolaki form is compared with the forms of the same meaning in ABVD's Proto-Bungku-Tolaki list (780) and in 42 other Bungku-Tolaki lists (41 of them contributed by one compiler, D. Mead; 13 languages by Glottolog code). The comparison is a look-alike screen: a normalized edit distance (Levenshtein 1966) between the written forms after bracketed material, hyphens, apostrophes and the glottal mark have been removed, computed so that up to three leading characters may be ignored on either side, with a match counted at a distance of 0.34 or less (a stricter run uses 0.25). The chance rate is the same comparison made against the forms of other meanings. The screen's sensitivity is measured on forms that ABVD itself places in a cognate set; because ABVD's coders and the screen both work from surface resemblance, that sensitivity is an upper bound on what the screen would find among cognates the coders missed. The same screen is applied to the uncoded Makasar forms, against the PMP entry and against the Bugis and Sa'dan Toraja forms of the same meaning. A look-alike is not a cognate judgment, and a distance of zero does not mean that two forms are identical. (c) </w:t>
       </w:r>
       <w:r>
         <w:rPr>
@@ -409,7 +409,7 @@
         <w:t>Similarity across lists.</w:t>
       </w:r>
       <w:r>
-        <w:t xml:space="preserve"> For every meaning, the uncoded forms of different lists are paired; the statistic is the mean normalised distance over all such pairs, compared with its distribution when the meaning labels of the uncoded forms are shuffled within each list (10,000 permutations); the number of look-alike pairs at the 0.34 threshold is counted beside it. Numerals are excluded from the primary set because decimal compounds are transparent across the lists. The coded forms, paired in the same way, serve as a positive control. The decision rules for the three-class count, for this test and for the spelling tests below were written down before the runs, on the same day and by the same analyst; none was registered externally.</w:t>
+        <w:t xml:space="preserve"> For every meaning, the uncoded forms of different lists are paired; the statistic is the mean normalized distance over all such pairs, compared with its distribution when the meaning labels of the uncoded forms are shuffled within each list (10,000 permutations); the number of look-alike pairs at the 0.34 threshold is counted beside it. Numerals are excluded from the primary set because decimal compounds are transparent across the lists. The coded forms, paired in the same way, serve as a positive control. The decision rules for the three-class count, the look-alike screens, this test and the spelling tests below were written down before the runs, on the same day and by the same analyst; none was registered externally.</w:t>
       </w:r>
     </w:p>
     <w:p>
@@ -480,8 +480,71 @@
         <w:t>dh</w:t>
       </w:r>
       <w:r>
-        <w:t xml:space="preserve"> were converted to single symbols, and the two size inputs (length and vowel count) were removed, each time re-running the cross-validation and the held-out-list assessment.</w:t>
-      </w:r>
+        <w:t xml:space="preserve"> were converted to single symbols, and the two size inputs (length and vowel count) were removed, each time re-running the cross-validation and the held-out-list assessment. Figure 2 shows how the parts of the study fit together.</w:t>
+      </w:r>
+    </w:p>
+    <w:p>
+      <w:pPr>
+        <w:pStyle w:val="OLcaption"/>
+      </w:pPr>
+      <w:r>
+        <w:t>FIGURE 2. THE WORKFLOW OF THE STUDY: DATA, LABEL, INPUTS, CLASSIFIER, AND THE THREE CHECKS ON WHAT "UNCODED" MEANS</w:t>
+      </w:r>
+    </w:p>
+    <w:p>
+      <w:pPr>
+        <w:pStyle w:val="OLtext"/>
+      </w:pPr>
+      <w:r>
+        <w:drawing>
+          <wp:inline xmlns:a="http://schemas.openxmlformats.org/drawingml/2006/main" xmlns:pic="http://schemas.openxmlformats.org/drawingml/2006/picture">
+            <wp:extent cx="3962400" cy="3017521"/>
+            <wp:docPr id="1" name="Picture 1"/>
+            <wp:cNvGraphicFramePr>
+              <a:graphicFrameLocks noChangeAspect="1"/>
+            </wp:cNvGraphicFramePr>
+            <a:graphic>
+              <a:graphicData uri="http://schemas.openxmlformats.org/drawingml/2006/picture">
+                <pic:pic>
+                  <pic:nvPicPr>
+                    <pic:cNvPr id="0" name="F2_workflow.png"/>
+                    <pic:cNvPicPr/>
+                  </pic:nvPicPr>
+                  <pic:blipFill>
+                    <a:blip r:embed="rId14"/>
+                    <a:stretch>
+                      <a:fillRect/>
+                    </a:stretch>
+                  </pic:blipFill>
+                  <pic:spPr>
+                    <a:xfrm>
+                      <a:off x="0" y="0"/>
+                      <a:ext cx="3962400" cy="3017521"/>
+                    </a:xfrm>
+                    <a:prstGeom prst="rect"/>
+                  </pic:spPr>
+                </pic:pic>
+              </a:graphicData>
+            </a:graphic>
+          </wp:inline>
+        </w:drawing>
+      </w:r>
+    </w:p>
+    <w:p>
+      <w:pPr>
+        <w:pStyle w:val="OLtext"/>
+      </w:pPr>
+      <w:r>
+        <w:rPr>
+          <w:highlight w:val="yellow"/>
+        </w:rPr>
+        <w:t>[Figure 2: preview for reading; the journal receives the separate TIFF file]</w:t>
+      </w:r>
+    </w:p>
+    <w:p>
+      <w:pPr>
+        <w:pStyle w:val="OL3ptseparator"/>
+      </w:pPr>
     </w:p>
     <w:p>
       <w:pPr>
@@ -504,7 +567,7 @@
         <w:pStyle w:val="OLtext"/>
       </w:pPr>
       <w:r>
-        <w:t>Table 1 gives the label by list. The uncoded share runs from 15.5 percent in the Muna list to 64.1 percent in the Tolaki list; over the six lists it is 32.3 percent. The lower end of the range rests on one circumstance of the database: the 44 Muna forms coded only through ABVD's second Muna list (Section 2.2). The classifier does not rest on them. With those 44 forms relabelled as uncoded, the cross-validated AUC moves from 0.727 to 0.741 for the full model and from 0.672 to 0.699 for the form-only model.</w:t>
+        <w:t>Table 1 gives the label by list. The uncoded share runs from 15.5 percent in the Muna list to 64.1 percent in the Tolaki list; over the six lists it is 32.3 percent. The lower end of the range rests on one circumstance of the database: the 44 Muna forms coded only through ABVD's second Muna list (Section 2.2). The classifier does not rest on them. With those 44 forms relabeled as uncoded, the cross-validated AUC moves from 0.727 to 0.741 for the full model and from 0.672 to 0.699 for the form-only model.</w:t>
       </w:r>
     </w:p>
     <w:p>
@@ -1294,7 +1357,7 @@
               <w:rPr>
                 <w:sz w:val="16"/>
               </w:rPr>
-              <w:t>1357</w:t>
+              <w:t>1,357</w:t>
             </w:r>
           </w:p>
         </w:tc>
@@ -1397,7 +1460,7 @@
         <w:pStyle w:val="OLtext"/>
       </w:pPr>
       <w:r>
-        <w:t>Table 2 gives, for each list, the share of meanings whose form is in the same cognate set as the PMP entry, coded in another set, or uncoded. For Makasar the three shares are 39.3, 25.9 and 34.8 percent of 201 meanings; for Bugis 48.3, 28.4 and 23.4; for Sa'dan Toraja 48.0, 33.0 and 19.0. The first class, a form in the PMP entry's set as ABVD codes it, is a lower bound on retention, not retention, because an uncoded meaning cannot be in the set whatever its origin; if every uncoded Makasar meaning turned out to belong there, the share would be 74.1 percent. With ABVD's doubtful assignments counted, the first class is 42.8 percent.</w:t>
+        <w:t>Table 2 gives, for each list, the share of meanings whose form is in the same cognate set as the PMP entry, coded in another set, or uncoded. For Makasar the three shares are 39.3, 25.9 and 34.8 percent of 201 meanings; for Bugis 48.3, 28.4 and 23.4; for Sa'dan Toraja 48.0, 33.0 and 19.0. The first class, a form in the PMP entry's set as ABVD codes it, is a lower bound on the share that ABVD would count as retained from PMP, not retention itself, because an uncoded meaning cannot be in the set whatever its origin; if every uncoded Makasar meaning turned out to belong there, the share would be 74.1 percent. With ABVD's doubtful assignments counted, the first class is 42.8 percent.</w:t>
       </w:r>
     </w:p>
     <w:p>
@@ -2044,7 +2107,7 @@
         <w:rPr>
           <w:sz w:val="16"/>
         </w:rPr>
-        <w:t>Note. Wilson 95 percent intervals; the unit is the meaning. The column "In the PMP entry's set" is a lower bound on retention, since an uncoded meaning cannot share a set with the PMP entry.</w:t>
+        <w:t>Note. Wilson 95 percent intervals; the unit is the meaning. The column "In the PMP entry's set" is a lower bound on the share ABVD would count as retained, since an uncoded meaning cannot share a set with the PMP entry. Figure 3 draws the same shares.</w:t>
       </w:r>
     </w:p>
     <w:p>
@@ -2054,6 +2117,69 @@
     </w:p>
     <w:p>
       <w:pPr>
+        <w:pStyle w:val="OLcaption"/>
+      </w:pPr>
+      <w:r>
+        <w:t>FIGURE 3. MEANINGS WITH A PROTO-MALAYO-POLYNESIAN ENTRY, BY THE CODING OF THE LIST'S FORM (THE SHARES OF TABLE 2)</w:t>
+      </w:r>
+    </w:p>
+    <w:p>
+      <w:pPr>
+        <w:pStyle w:val="OLtext"/>
+      </w:pPr>
+      <w:r>
+        <w:drawing>
+          <wp:inline xmlns:a="http://schemas.openxmlformats.org/drawingml/2006/main" xmlns:pic="http://schemas.openxmlformats.org/drawingml/2006/picture">
+            <wp:extent cx="3962400" cy="2842101"/>
+            <wp:docPr id="2" name="Picture 2"/>
+            <wp:cNvGraphicFramePr>
+              <a:graphicFrameLocks noChangeAspect="1"/>
+            </wp:cNvGraphicFramePr>
+            <a:graphic>
+              <a:graphicData uri="http://schemas.openxmlformats.org/drawingml/2006/picture">
+                <pic:pic>
+                  <pic:nvPicPr>
+                    <pic:cNvPr id="0" name="F3_pmp_classes.png"/>
+                    <pic:cNvPicPr/>
+                  </pic:nvPicPr>
+                  <pic:blipFill>
+                    <a:blip r:embed="rId15"/>
+                    <a:stretch>
+                      <a:fillRect/>
+                    </a:stretch>
+                  </pic:blipFill>
+                  <pic:spPr>
+                    <a:xfrm>
+                      <a:off x="0" y="0"/>
+                      <a:ext cx="3962400" cy="2842101"/>
+                    </a:xfrm>
+                    <a:prstGeom prst="rect"/>
+                  </pic:spPr>
+                </pic:pic>
+              </a:graphicData>
+            </a:graphic>
+          </wp:inline>
+        </w:drawing>
+      </w:r>
+    </w:p>
+    <w:p>
+      <w:pPr>
+        <w:pStyle w:val="OLtext"/>
+      </w:pPr>
+      <w:r>
+        <w:rPr>
+          <w:highlight w:val="yellow"/>
+        </w:rPr>
+        <w:t>[Figure 3: preview for reading; the journal receives the separate TIFF file]</w:t>
+      </w:r>
+    </w:p>
+    <w:p>
+      <w:pPr>
+        <w:pStyle w:val="OL3ptseparator"/>
+      </w:pPr>
+    </w:p>
+    <w:p>
+      <w:pPr>
         <w:pStyle w:val="OLtextindented"/>
       </w:pPr>
       <w:r>
@@ -2073,7 +2199,7 @@
         <w:pStyle w:val="OLtextindented"/>
       </w:pPr>
       <w:r>
-        <w:t>How does this fit the published figure? The 38 percent cited by Bulbeck, Pasqua and Di Lello (2000:103) comes from Bellwood (1997:115), who reports Blust's lexicostatistical comparison of 62 Austronesian languages with a 200-item reconstructed PMP list: Western Malayo-Polynesian languages retain 41 percent on average, Malay 59, Minangkabau 50, Tagalog 46, Makasar 38, Sundanese 35 and Yogyakarta Javanese 30. Our 39.3 percent is a count of the same kind, in the same tradition (ABVD's PMP list is Blust's), on a different Makasar word list; that the two agree is not independent confirmation of either, and in its source the figure is not presented as low. A more independent comparison is Sirk's (1989:71) lexicostatistical table, made with other word lists and another judge: Makasar shares 45 percent with Bugis and 42 with Sa'dan, while Bugis and Sa'dan share 60. ABVD's cognate coding gives 41.4, 39.2 and 53.1 percent for the same pairs, the same order, with somewhat smaller gaps. The data are thus compatible with the lexical divergence of Makasar reported in that literature; they do not establish it, and they say nothing about its cause, whether substratum, borrowing or innovation. The 62 percent that Bulbeck, Pasqua and Di Lello call open to investigation is the complement of a retention count: it contains forms with cognates outside the PMP set as well as forms with none, and so cannot be set against the uncoded share of Table 1.</w:t>
+        <w:t>How does this fit the published figure? The 38 percent cited by Bulbeck, Pasqua, and Di Lello (2000:103) comes from Bellwood (1997:115), who reports Blust's lexicostatistical comparison of 62 Austronesian languages with a 200-item reconstructed PMP list: Western Malayo-Polynesian languages retain 41 percent on average, Malay 59, Minangkabau 50, Tagalog 46, Makasar 38, Sundanese 35 and Yogyakarta Javanese 30. Our 39.3 percent is a count of the same kind, in the same tradition (ABVD's PMP list is Blust's), on a different Makasar word list; that the two agree is not independent confirmation of either, and in its source the figure is not presented as low. A more independent comparison is Sirk's (1989:71) lexicostatistical table, made with other word lists and another judge: Makasar shares 45 percent with Bugis and 42 with Sa'dan, while Bugis and Sa'dan share 60. ABVD's cognate coding gives 41.4, 39.2 and 53.1 percent for the same pairs, the same order, with somewhat smaller gaps. The data are thus compatible with the lexical divergence of Makasar reported in that literature; they do not establish it, and they say nothing about its cause, whether substratum, borrowing or innovation. The 62 percent that Bulbeck, Pasqua, and Di Lello call open to investigation is the complement of a retention count: it contains forms with cognates outside the PMP set as well as forms with none, and so cannot be set against the uncoded share of table 1.</w:t>
       </w:r>
     </w:p>
     <w:p>
@@ -2097,7 +2223,7 @@
         <w:pStyle w:val="OLtextindented"/>
       </w:pPr>
       <w:r>
-        <w:t>The look-alike screen shows where the uncoded Tolaki forms recur. Of the 134 uncoded forms, 70.9 percent have a look-alike of the same meaning in the Proto-Bungku-Tolaki list or in one of the 42 other lists, against 10.5 percent expected by chance; at the strict threshold the figures are 63.4 against 3.0 percent. For the coded Tolaki forms the same screen finds a look-alike for 95.9 percent (chance 14.6). Most uncoded forms of this list, then, have a similar-looking form of the same meaning elsewhere in the subgroup. Of the 34 uncoded forms that match an entry of the Proto-Bungku-Tolaki list, seven match an entry that ABVD does assign to a cognate set; these seven are the clearest candidates for coding gaps in the plain sense, although the match is the screen's, not a cognate judgement. Twelve of the 128 uncoded forms whose meaning has a PMP entry resemble that entry by the screen (about two are expected by chance; nine remain at the strict threshold; one of the twelve is loan-flagged); the screen finds 48 percent of the Tolaki forms that ABVD itself places in the PMP set, so that figure too is an upper bound. For the remaining forms the study cannot decide between a coding gap, a chance resemblance and a loan.</w:t>
+        <w:t>The look-alike screen shows where the uncoded Tolaki forms have counterparts. Of the 134 uncoded forms, 70.9 percent have a look-alike of the same meaning in the Proto-Bungku-Tolaki list or in one of the 42 other lists, against 10.5 percent expected by chance; at the strict threshold the figures are 63.4 against 3.0 percent. For the coded Tolaki forms the same screen finds a look-alike for 95.9 percent (chance 14.6). Most uncoded forms of this list, then, have a similar-looking form of the same meaning elsewhere in the subgroup. Of the 34 uncoded forms that match an entry of the Proto-Bungku-Tolaki list, seven match an entry that ABVD does assign to a cognate set; these seven are the clearest candidates for coding gaps in the plain sense, although the match is the screen's, not a cognate judgment. Twelve of the 128 uncoded forms whose meaning has a PMP entry resemble that entry by the screen (about two are expected by chance; nine remain at the strict threshold; one of the twelve is loan-flagged); the screen finds 48 percent of the Tolaki forms that ABVD itself places in the PMP set, so that figure too is an upper bound. For the remaining forms the study cannot decide between a coding gap, a chance resemblance and a loan.</w:t>
       </w:r>
     </w:p>
     <w:p>
@@ -2105,7 +2231,7 @@
         <w:pStyle w:val="OLtextindented"/>
       </w:pPr>
       <w:r>
-        <w:t>Recurrence within the subgroup says nothing about origin. The first reviewer's example makes the point: a word borrowed from a non-Austronesian language by the speakers of a low-level proto-language can be inherited by all its daughters and recur across the subgroup exactly as an inherited Austronesian word does. The screen also compares spellings, not sound correspondences, across lists that are largely one compiler's, and ABVD's own note places the Tolaki list in the Konawe dialect, which is also one of the five dialect lists; the twelve PMP look-alikes are listed in the released files, and none of them should be taken as an etymology before a specialist has looked at it.</w:t>
+        <w:t>A look-alike within the subgroup says nothing about origin. One example makes the point: a word borrowed from a non-Austronesian language by the speakers of a low-level proto-language can be inherited by all its daughters and recur across the subgroup exactly as an inherited Austronesian word does. The screen also compares spellings, not sound correspondences, across lists that are largely one compiler's, and ABVD's own note places the Tolaki list in the Konawe dialect, which is also one of the five dialect lists; the twelve PMP look-alikes are listed in the released files, and none of them should be taken as an etymology before a specialist has looked at it.</w:t>
       </w:r>
     </w:p>
     <w:p>
@@ -2113,7 +2239,7 @@
         <w:pStyle w:val="OLheadingB-level"/>
       </w:pPr>
       <w:r>
-        <w:t>Can uncoded forms be told apart?.</w:t>
+        <w:t>Can uncoded forms be told apart?</w:t>
       </w:r>
     </w:p>
     <w:p>
@@ -2121,7 +2247,7 @@
         <w:pStyle w:val="OLtext"/>
       </w:pPr>
       <w:r>
-        <w:t>Table 3 gives the cross-validated performance of the three classifiers on the two input sets, and Table 4 the held-out-list results. With the written form and the meaning as inputs, XGBoost ranks uncoded above coded forms with an AUC of 0.727 (random forest 0.727, logistic regression 0.700); with the written form alone, 0.672 (0.683, 0.671). The standard deviation over the ten repetition means is 0.007 and over the fifty test sets 0.027; the bootstrap interval around the pooled score is about plus or minus 0.03.</w:t>
+        <w:t>Table 3 gives the cross-validated performance of the three classifiers on the two input sets, and table 4 the held-out-list results. With the written form and the meaning as inputs, XGBoost ranks uncoded above coded forms with an AUC of 0.727 (random forest 0.727, logistic regression 0.700); with the written form alone, 0.672 (0.683, 0.671). The standard deviation over the ten repetition means is 0.007 and over the fifty test sets 0.027; the bootstrap interval around the pooled score is about plus or minus 0.03.</w:t>
       </w:r>
     </w:p>
     <w:p>
@@ -4170,7 +4296,7 @@
               <w:rPr>
                 <w:sz w:val="16"/>
               </w:rPr>
-              <w:t>Mean (SD) over the six lists</w:t>
+              <w:t>Mean (standard deviation) over the six lists</w:t>
             </w:r>
           </w:p>
         </w:tc>
@@ -4273,7 +4399,70 @@
         <w:rPr>
           <w:sz w:val="16"/>
         </w:rPr>
-        <w:t>Note. F+M = form and meaning inputs (25); F = form inputs only (17); Majority = accuracy of the majority answer for that list.</w:t>
+        <w:t>Note. F+M = form and meaning inputs (25); F = form inputs only (17); Majority = accuracy of the majority answer for that list. Figure 4 plots the two AUC columns.</w:t>
+      </w:r>
+    </w:p>
+    <w:p>
+      <w:pPr>
+        <w:pStyle w:val="OL3ptseparator"/>
+      </w:pPr>
+    </w:p>
+    <w:p>
+      <w:pPr>
+        <w:pStyle w:val="OLcaption"/>
+      </w:pPr>
+      <w:r>
+        <w:t>FIGURE 4. AUC FOR A HELD-OUT LIST, BY INPUT SET, WITH THE CHANCE LINE AT 0.5 (THE AUC COLUMNS OF TABLE 4)</w:t>
+      </w:r>
+    </w:p>
+    <w:p>
+      <w:pPr>
+        <w:pStyle w:val="OLtext"/>
+      </w:pPr>
+      <w:r>
+        <w:drawing>
+          <wp:inline xmlns:a="http://schemas.openxmlformats.org/drawingml/2006/main" xmlns:pic="http://schemas.openxmlformats.org/drawingml/2006/picture">
+            <wp:extent cx="3962400" cy="2140308"/>
+            <wp:docPr id="3" name="Picture 3"/>
+            <wp:cNvGraphicFramePr>
+              <a:graphicFrameLocks noChangeAspect="1"/>
+            </wp:cNvGraphicFramePr>
+            <a:graphic>
+              <a:graphicData uri="http://schemas.openxmlformats.org/drawingml/2006/picture">
+                <pic:pic>
+                  <pic:nvPicPr>
+                    <pic:cNvPr id="0" name="F4_heldout_auc.png"/>
+                    <pic:cNvPicPr/>
+                  </pic:nvPicPr>
+                  <pic:blipFill>
+                    <a:blip r:embed="rId16"/>
+                    <a:stretch>
+                      <a:fillRect/>
+                    </a:stretch>
+                  </pic:blipFill>
+                  <pic:spPr>
+                    <a:xfrm>
+                      <a:off x="0" y="0"/>
+                      <a:ext cx="3962400" cy="2140308"/>
+                    </a:xfrm>
+                    <a:prstGeom prst="rect"/>
+                  </pic:spPr>
+                </pic:pic>
+              </a:graphicData>
+            </a:graphic>
+          </wp:inline>
+        </w:drawing>
+      </w:r>
+    </w:p>
+    <w:p>
+      <w:pPr>
+        <w:pStyle w:val="OLtext"/>
+      </w:pPr>
+      <w:r>
+        <w:rPr>
+          <w:highlight w:val="yellow"/>
+        </w:rPr>
+        <w:t>[Figure 4: preview for reading; the journal receives the separate TIFF file]</w:t>
       </w:r>
     </w:p>
     <w:p>
@@ -5686,7 +5875,7 @@
         <w:rPr>
           <w:sz w:val="16"/>
         </w:rPr>
-        <w:t>‡ Mantel-Haenszel odds ratio of being uncoded, stratified by list.</w:t>
+        <w:t>‡ Mantel-Haenszel odds ratio of being uncoded, stratified by list. CI = confidence interval.</w:t>
       </w:r>
     </w:p>
     <w:p>
@@ -5718,7 +5907,7 @@
         <w:pStyle w:val="OLtextindented"/>
       </w:pPr>
       <w:r>
-        <w:t>Several properties reported in the earlier version of this paper do not stand as stated. The onset-string input (the strings the code calls prefix-like) is more frequent among uncoded forms, 37.0 against 25.2 percent (odds ratio 1.57 [1.20, 2.04]), not less, as we had written. But it is not separable from length: with the number of letters held fixed the odds ratio is 1.09 [0.80, 1.48], and with the number of letters after the matched string held fixed it is 2.51 [1.85, 3.40]. Two ways of equalising length give two answers, so the data neither show fewer onset strings nor establish more; a length criterion alone ("six letters or more") gives an odds ratio of 2.56 [1.98, 3.32]. The nasal input behaves in the same way: 30.4 against 23.7 percent as coded (1.55 [1.18, 2.04]), 21.0 against 12.7 percent for a strict nasal-plus-stop definition (2.05 [1.47, 2.84]), and 0.95 [0.69, 1.30] or 1.24 [0.84, 1.81] with letters held fixed. The hyphen-or-repetition input gives about the same estimate under every definition (1.68 [1.12, 2.51] as coded; 1.61 [0.87, 2.98] for a repeated block alone; 1.57 [0.94, 2.63] for a hyphen alone), and the intervals of the two halves include one; we do not treat it as a separate property, and the data do not show that there is no difference. "Ends in a vowel" is the glottal mark counted a second time: in the three South Sulawesi lists, the only lists with consonant-final forms, uncoded forms are 23.8 percent of the vowel-final forms, 25.9 percent of the forms ending in another consonant and 39.3 percent of the forms ending in a glottal mark; with the glottal-final forms set aside the odds ratio is 0.91 [0.58, 1.44]. The core-set indicator does not differ (1.04 [0.76, 1.43]).</w:t>
+        <w:t>Several properties reported in the earlier version of this paper do not stand as stated. The onset-string input (the strings the code calls prefix-like) is more frequent among uncoded forms, 37.0 against 25.2 percent (odds ratio 1.57 [1.20, 2.04]), not less, as we had written. But it is not separable from length: with the number of letters held fixed the odds ratio is 1.09 [0.80, 1.48], and with the number of letters after the matched string held fixed it is 2.51 [1.85, 3.40]. Two ways of equalizing length give two answers, so the data neither show fewer onset strings nor establish more; a length criterion alone ("six letters or more") gives an odds ratio of 2.56 [1.98, 3.32]. The nasal input behaves in the same way: 30.4 against 23.7 percent as coded (1.55 [1.18, 2.04]), 21.0 against 12.7 percent for a strict nasal-plus-stop definition (2.05 [1.47, 2.84]), and 0.95 [0.70, 1.30] or 1.24 [0.84, 1.81] with letters held fixed. The hyphen-or-repetition input gives about the same estimate under every definition (1.68 [1.12, 2.51] as coded; 1.61 [0.87, 2.98] for a repeated block alone; 1.57 [0.94, 2.63] for a hyphen alone), and the intervals of the two halves include one; we do not treat it as a separate property, and the data do not show that uncoded and coded forms do not differ in it. "Ends in a vowel" is the glottal mark counted a second time: in the three South Sulawesi lists, the only lists with consonant-final forms, uncoded forms are 23.8 percent of the vowel-final forms, 25.9 percent of the forms ending in another consonant and 39.3 percent of the forms ending in a glottal mark; with the glottal-final forms set aside the odds ratio is 0.91 [0.58, 1.44]. The core-set indicator does not differ (1.04 [0.76, 1.43]).</w:t>
       </w:r>
     </w:p>
     <w:p>
@@ -5726,7 +5915,7 @@
         <w:pStyle w:val="OLtextindented"/>
       </w:pPr>
       <w:r>
-        <w:t>Figure 1 ranks the inputs by their mean absolute contribution to the predictions of the full model. The six largest are the glottal mark (0.279), length (0.276), the action meaning (0.269), the vowel count (0.266), the vowel share (0.210) and consonant-letter clusters (0.198). The figure describes the classifier, not the vocabulary: for "ends in a vowel" the model's direction is the reverse of the within-list association. Two circumstances could produce that: all 285 consonant-final forms are in the three South Sulawesi lists, so the input also tells the model which list a form comes from, and the input overlaps with the glottal input. Which of the two accounts for the sign was not tested. Statements about the vocabulary in this paper rest on Table 5, not on Figure 1.</w:t>
+        <w:t>Figure 1 ranks the inputs by their mean absolute contribution to the predictions of the full model. The six largest are the glottal mark (0.279), length (0.276), the action meaning (0.269), the vowel count (0.266), the vowel share (0.210) and consonant-letter clusters (0.198). The figure describes the classifier, not the vocabulary: for "ends in a vowel" the model's direction is the reverse of the within-list association. Two circumstances could produce that: all 285 consonant-final forms are in the three South Sulawesi lists, so the input also tells the model which list a form comes from, and the input overlaps with the glottal input. Which of the two accounts for the sign was not tested. Statements about the vocabulary in this paper rest on table 5, not on figure 1.</w:t>
       </w:r>
     </w:p>
     <w:p>
@@ -5735,6 +5924,45 @@
       </w:pPr>
       <w:r>
         <w:t>FIGURE 1. MEAN ABSOLUTE CONTRIBUTION OF EACH INPUT TO THE PREDICTIONS OF THE FULL MODEL (SHAP VALUES), WITH THE DIRECTION OF EACH INPUT'S EFFECT ON THE SCORE</w:t>
+      </w:r>
+    </w:p>
+    <w:p>
+      <w:pPr>
+        <w:pStyle w:val="OLtext"/>
+      </w:pPr>
+      <w:r>
+        <w:drawing>
+          <wp:inline xmlns:a="http://schemas.openxmlformats.org/drawingml/2006/main" xmlns:pic="http://schemas.openxmlformats.org/drawingml/2006/picture">
+            <wp:extent cx="3962400" cy="6583682"/>
+            <wp:docPr id="4" name="Picture 4"/>
+            <wp:cNvGraphicFramePr>
+              <a:graphicFrameLocks noChangeAspect="1"/>
+            </wp:cNvGraphicFramePr>
+            <a:graphic>
+              <a:graphicData uri="http://schemas.openxmlformats.org/drawingml/2006/picture">
+                <pic:pic>
+                  <pic:nvPicPr>
+                    <pic:cNvPr id="0" name="F1_input_importance.png"/>
+                    <pic:cNvPicPr/>
+                  </pic:nvPicPr>
+                  <pic:blipFill>
+                    <a:blip r:embed="rId17"/>
+                    <a:stretch>
+                      <a:fillRect/>
+                    </a:stretch>
+                  </pic:blipFill>
+                  <pic:spPr>
+                    <a:xfrm>
+                      <a:off x="0" y="0"/>
+                      <a:ext cx="3962400" cy="6583682"/>
+                    </a:xfrm>
+                    <a:prstGeom prst="rect"/>
+                  </pic:spPr>
+                </pic:pic>
+              </a:graphicData>
+            </a:graphic>
+          </wp:inline>
+        </w:drawing>
       </w:r>
     </w:p>
     <w:p>
@@ -5745,7 +5973,7 @@
         <w:rPr>
           <w:highlight w:val="yellow"/>
         </w:rPr>
-        <w:t>[Figure 1 about here — separate file]</w:t>
+        <w:t>[Figure 1: preview for reading; the journal receives the separate TIFF file]</w:t>
       </w:r>
     </w:p>
     <w:p>
@@ -5767,7 +5995,7 @@
         <w:t>a</w:t>
       </w:r>
       <w:r>
-        <w:t>, as do 81.7 percent of the Makasar ones, while 61.7 percent of the Tolaki action forms begin with one of the nine onset strings. One reading of the whole bundle is that uncoded forms are more often morphologically complex citation forms, verbs with their affixes. We state it as a reading. No form was segmented in this study, the only segmentation marked by compilers in the data (the hyphen in the Bugis and Sa'dan Toraja lists, which appears to mark a morpheme boundary) gives a mixed result (uncoded forms are 34.4 percent of hyphenated Bugis forms against 22.5 percent of the rest, and 20.0 against 20.9 percent in Sa'dan Toraja), and a rival reading fits the same numbers: affixed citation forms may simply be harder to code, so that the profile would be a profile of coding difficulty rather than of the words. A third reading, that some lists write glottalisation where others do not, is taken up in Section 3.6.</w:t>
+        <w:t>, as do 81.7 percent of the Makasar ones, while 61.7 percent of the Tolaki action forms begin with one of the nine onset strings. One reading of the whole bundle is that uncoded forms are more often morphologically complex citation forms, verbs with their affixes. We state it as a reading. No form was segmented in this study, the only segmentation marked by compilers in the data (the hyphen in the Bugis and Sa'dan Toraja lists, which appears to mark a morpheme boundary) gives a mixed result (uncoded forms are 34.4 percent of hyphenated Bugis forms against 22.5 percent of the rest, and 20.0 against 20.9 percent in Sa'dan Toraja), and a rival reading fits the same numbers: affixed citation forms may simply be harder to code, so that the profile would be a profile of coding difficulty rather than of the words. A third reading, that some lists write glottalization where others do not, is taken up in section 3.6.</w:t>
       </w:r>
     </w:p>
     <w:p>
@@ -6686,7 +6914,7 @@
               <w:rPr>
                 <w:sz w:val="16"/>
               </w:rPr>
-              <w:t>1357</w:t>
+              <w:t>1,357</w:t>
             </w:r>
           </w:p>
         </w:tc>
@@ -6785,7 +7013,7 @@
         <w:rPr>
           <w:sz w:val="16"/>
         </w:rPr>
-        <w:t>Note. "Profile" = score of 0.5 or more; the scores are out of sample (five-fold cross-validation, ten repetitions). Kappa is Cohen's.</w:t>
+        <w:t>Note. "Profile" = score of 0.5 or more; the scores are out of sample (five-fold cross-validation, ten repetitions) and averaged over the ten repetitions, which is why the cells imply an accuracy (0.727) slightly above the per-repetition accuracy of table 3 (0.719). Kappa is Cohen's.</w:t>
       </w:r>
     </w:p>
     <w:p>
@@ -8076,7 +8304,7 @@
         <w:rPr>
           <w:sz w:val="16"/>
         </w:rPr>
-        <w:t>Note. Forms are given as ABVD records them and have not been assessed etymologically. "Set" is ABVD's cognate-set number; "PMP (ABVD)" is the Proto-Malayo-Polynesian entry for the meaning; the nearest look-alike is a spelling match by the screen of Section 2.6, which ignores up to three leading characters, so a distance of 0.0 does not mean identity. ‡ = flagged as a loan by ABVD.</w:t>
+        <w:t>Note. Forms are given as ABVD records them and have not been assessed etymologically. "Set" is ABVD's cognate-set number; "PMP (ABVD)" is the Proto-Malayo-Polynesian entry for the meaning; the nearest look-alike is a spelling match by the screen of section 2.6, which ignores up to three leading characters, so a distance of 0.0 does not mean identity.</w:t>
       </w:r>
     </w:p>
     <w:p>
@@ -8133,7 +8361,7 @@
         <w:pStyle w:val="OLheadingB-level"/>
       </w:pPr>
       <w:r>
-        <w:t>Does the result depend on spelling?.</w:t>
+        <w:t>Does the result depend on spelling?</w:t>
       </w:r>
     </w:p>
     <w:p>
@@ -8159,7 +8387,78 @@
         <w:t>k</w:t>
       </w:r>
       <w:r>
-        <w:t xml:space="preserve">, or not written at all, is invisible to it, and the lists differ in how they write it: 36 percent of the Makasar forms carry ʔ, 22 percent of the Sa'dan Toraja forms (47 with ʔ, one with an apostrophe), 21 percent of the Bugis forms, 14 percent of the Tolaki forms (29, all with an apostrophe, which the compiler's note says stands for a glottal stop), four Wolio forms (two uncoded, two coded) and no Muna form. Whether these differences are differences of notation or of phonology we cannot say; a language without a phonemic glottal stop has nothing to write, and the question is one for specialists. In the Tolaki list every form written with an apostrophe is uncoded. Eleven Sa'dan Toraja forms end in </w:t>
+        <w:t>, or not written at all, is invisible to it, and the lists differ in how they write it: 36 percent of the Makasar forms carry ʔ, 22 percent of the Sa'dan Toraja forms (47 with ʔ, one with an apostrophe), 21 percent of the Bugis forms, 14 percent of the Tolaki forms (29, all with an apostrophe, which the compiler's note says stands for a glottal stop), four Wolio forms (two uncoded, two coded) and no Muna form. Whether these differences are differences of notation or of phonology we cannot say; a language without a phonemic glottal stop has nothing to write, and the question is one for specialists. In the Tolaki list every form written with an apostrophe is uncoded. Figure 5 gives the share of marked forms among uncoded and among coded forms for each list.</w:t>
+      </w:r>
+    </w:p>
+    <w:p>
+      <w:pPr>
+        <w:pStyle w:val="OLcaption"/>
+      </w:pPr>
+      <w:r>
+        <w:t>FIGURE 5. FORMS WITH A WRITTEN GLOTTAL MARK, UNCODED AGAINST CODED, BY LIST (NUMBERS OF UNCODED AND CODED FORMS IN PARENTHESES)</w:t>
+      </w:r>
+    </w:p>
+    <w:p>
+      <w:pPr>
+        <w:pStyle w:val="OLtext"/>
+      </w:pPr>
+      <w:r>
+        <w:drawing>
+          <wp:inline xmlns:a="http://schemas.openxmlformats.org/drawingml/2006/main" xmlns:pic="http://schemas.openxmlformats.org/drawingml/2006/picture">
+            <wp:extent cx="3962400" cy="2491801"/>
+            <wp:docPr id="5" name="Picture 5"/>
+            <wp:cNvGraphicFramePr>
+              <a:graphicFrameLocks noChangeAspect="1"/>
+            </wp:cNvGraphicFramePr>
+            <a:graphic>
+              <a:graphicData uri="http://schemas.openxmlformats.org/drawingml/2006/picture">
+                <pic:pic>
+                  <pic:nvPicPr>
+                    <pic:cNvPr id="0" name="F5_glottal_by_list.png"/>
+                    <pic:cNvPicPr/>
+                  </pic:nvPicPr>
+                  <pic:blipFill>
+                    <a:blip r:embed="rId18"/>
+                    <a:stretch>
+                      <a:fillRect/>
+                    </a:stretch>
+                  </pic:blipFill>
+                  <pic:spPr>
+                    <a:xfrm>
+                      <a:off x="0" y="0"/>
+                      <a:ext cx="3962400" cy="2491801"/>
+                    </a:xfrm>
+                    <a:prstGeom prst="rect"/>
+                  </pic:spPr>
+                </pic:pic>
+              </a:graphicData>
+            </a:graphic>
+          </wp:inline>
+        </w:drawing>
+      </w:r>
+    </w:p>
+    <w:p>
+      <w:pPr>
+        <w:pStyle w:val="OLtext"/>
+      </w:pPr>
+      <w:r>
+        <w:rPr>
+          <w:highlight w:val="yellow"/>
+        </w:rPr>
+        <w:t>[Figure 5: preview for reading; the journal receives the separate TIFF file]</w:t>
+      </w:r>
+    </w:p>
+    <w:p>
+      <w:pPr>
+        <w:pStyle w:val="OL3ptseparator"/>
+      </w:pPr>
+    </w:p>
+    <w:p>
+      <w:pPr>
+        <w:pStyle w:val="OLtextindented"/>
+      </w:pPr>
+      <w:r>
+        <w:t xml:space="preserve">Eleven Sa'dan Toraja forms end in </w:t>
       </w:r>
       <w:r>
         <w:rPr>
@@ -8230,7 +8529,7 @@
         <w:t>nk</w:t>
       </w:r>
       <w:r>
-        <w:t xml:space="preserve"> inputs); leaving the mark unwritten costs 0.006; leaving it unwritten but doubling a following consonant, so that a pre-glottalised consonant becomes a geminate, costs 0.007; unifying the apostrophe to ʔ changes no input. The AUC stays at or above 0.710 in every variant (held-out lists down to 0.677). By the rule written before the run (a loss between 0.010 and 0.020 counts as partial dependence), the result depends partly on how the glottal stop is written: nearly the same result, not the same result. No noise estimate exists for these differences, so their size relative to chance variation is not known.</w:t>
+        <w:t xml:space="preserve"> inputs); leaving the mark unwritten costs 0.006; leaving it unwritten but doubling a following consonant, so that a pre-glottalized consonant becomes a geminate, costs 0.007; unifying the apostrophe to ʔ changes no input. The AUC stays at or above 0.710 in every variant (held-out lists down to 0.677). By the rule written before the run (a loss between 0.010 and 0.020 counts as partial dependence), the result depends partly on how the glottal stop is written: nearly the same result, not the same result. No noise estimate exists for these differences, so their size relative to chance variation is not known.</w:t>
       </w:r>
     </w:p>
     <w:p>
@@ -8534,7 +8833,7 @@
               <w:rPr>
                 <w:sz w:val="16"/>
               </w:rPr>
-              <w:t>-0.017</w:t>
+              <w:t>−0.016</w:t>
             </w:r>
           </w:p>
         </w:tc>
@@ -8568,7 +8867,7 @@
               <w:rPr>
                 <w:sz w:val="16"/>
               </w:rPr>
-              <w:t>-0.020</w:t>
+              <w:t>−0.019</w:t>
             </w:r>
           </w:p>
         </w:tc>
@@ -8638,7 +8937,7 @@
               <w:rPr>
                 <w:sz w:val="16"/>
               </w:rPr>
-              <w:t>-0.017</w:t>
+              <w:t>−0.016</w:t>
             </w:r>
           </w:p>
         </w:tc>
@@ -8672,7 +8971,7 @@
               <w:rPr>
                 <w:sz w:val="16"/>
               </w:rPr>
-              <w:t>-0.024</w:t>
+              <w:t>−0.024</w:t>
             </w:r>
           </w:p>
         </w:tc>
@@ -8742,7 +9041,7 @@
               <w:rPr>
                 <w:sz w:val="16"/>
               </w:rPr>
-              <w:t>-0.007</w:t>
+              <w:t>−0.006</w:t>
             </w:r>
           </w:p>
         </w:tc>
@@ -8776,7 +9075,7 @@
               <w:rPr>
                 <w:sz w:val="16"/>
               </w:rPr>
-              <w:t>-0.002</w:t>
+              <w:t>−0.001</w:t>
             </w:r>
           </w:p>
         </w:tc>
@@ -8846,7 +9145,7 @@
               <w:rPr>
                 <w:sz w:val="16"/>
               </w:rPr>
-              <w:t>-0.007</w:t>
+              <w:t>−0.007</w:t>
             </w:r>
           </w:p>
         </w:tc>
@@ -8880,7 +9179,7 @@
               <w:rPr>
                 <w:sz w:val="16"/>
               </w:rPr>
-              <w:t>-0.005</w:t>
+              <w:t>−0.005</w:t>
             </w:r>
           </w:p>
         </w:tc>
@@ -9054,7 +9353,7 @@
               <w:rPr>
                 <w:sz w:val="16"/>
               </w:rPr>
-              <w:t>-0.017</w:t>
+              <w:t>−0.016</w:t>
             </w:r>
           </w:p>
         </w:tc>
@@ -9088,7 +9387,7 @@
               <w:rPr>
                 <w:sz w:val="16"/>
               </w:rPr>
-              <w:t>-0.020</w:t>
+              <w:t>−0.019</w:t>
             </w:r>
           </w:p>
         </w:tc>
@@ -9227,7 +9526,7 @@
         <w:t>dh</w:t>
       </w:r>
       <w:r>
-        <w:t xml:space="preserve"> from the list, and no loanword was removed from the classifier's data. Word size, on the other hand, is one of the things the classifier uses: removing the length input alone changes nothing, because the vowel count carries the same information, but removing both size inputs costs 0.014 of AUC with form and meaning inputs and 0.023 with the form alone. The earlier version's statement that the result does not depend on form length is withdrawn, as is its statement that the profile is not an orthographic artefact: the glottal-mark result above is exactly a dependence on orthography, of modest size.</w:t>
+        <w:t xml:space="preserve"> from the list, and no loanword was removed from the classifier's data. Word size, on the other hand, is one of the things the classifier uses: removing the length input alone changes nothing, because the vowel count carries the same information, but removing both size inputs costs 0.014 of AUC with form and meaning inputs and 0.023 with the form alone. The earlier version's statement that the result does not depend on form length is withdrawn, as is its statement that the profile is not an orthographic artifact: the glottal-mark result above is exactly a dependence on orthography, of modest size.</w:t>
       </w:r>
     </w:p>
     <w:p>
@@ -9235,7 +9534,7 @@
         <w:pStyle w:val="OLheadingB-level"/>
       </w:pPr>
       <w:r>
-        <w:t>Are uncoded forms similar across lists?.</w:t>
+        <w:t>Are uncoded forms similar across lists?</w:t>
       </w:r>
     </w:p>
     <w:p>
@@ -9243,7 +9542,7 @@
         <w:pStyle w:val="OLtext"/>
       </w:pPr>
       <w:r>
-        <w:t>The earlier version of this paper reported a clustering analysis and a test with p = 0.569 as evidence that the uncoded forms share no word families across the lists. The test compared a mean over twenty meanings with single draws of mostly coded vocabulary and did not test that hypothesis; the clustering's "optimal" number of clusters was the edge of the range searched. Both are withdrawn and replaced by the permutation test of Section 2.6.</w:t>
+        <w:t>The earlier version of this paper reported a clustering analysis and a test with p = 0.569 as evidence that the uncoded forms share no word families across the lists. The test compared a mean over twenty meanings with single draws of mostly coded vocabulary and did not test that hypothesis; the clustering's "optimal" number of clusters was the edge of the range searched. Both are withdrawn and replaced by the permutation test of section 2.6.</w:t>
       </w:r>
     </w:p>
     <w:p>
@@ -9251,7 +9550,7 @@
         <w:pStyle w:val="OLtextindented"/>
       </w:pPr>
       <w:r>
-        <w:t xml:space="preserve">Among the uncoded forms without numerals (411 forms, 440 same-meaning pairs across lists), the mean distance between same-meaning forms is 0.836, against 0.869 when meanings are shuffled (permutation standard deviation 0.006; none of 10,000 permutations reached the observed value). Four pairs are look-alikes at the 0.34 threshold, against 0.52 expected (p = 0.0016). The positive control shows what a shared layer looks like in the same measure: among the coded forms (1,793 pairs) the mean distance is 0.578 against 0.856, with 472 look-alike pairs against 8.5 expected. The excess among uncoded forms is about one eighth of the excess among coded forms on the distance measure and about one thirtieth on look-alike pairs (comparing the excesses over expectation). The four pairs are Bugis </w:t>
+        <w:t xml:space="preserve">Among the uncoded forms without numerals (411 forms, 440 same-meaning pairs across lists), the mean distance between same-meaning forms is 0.836, against 0.869 when meanings are shuffled (permutation standard deviation 0.006; none of 10,000 permutations reached the observed value). Four pairs are look-alikes at the 0.34 threshold, against 0.52 expected (p = 0.0016). The positive control shows what a shared layer looks like in the same measure: among the coded forms (1,793 pairs) the mean distance is 0.578 against 0.856, with 472 look-alike pairs against 8.5 expected. The excess among uncoded forms is about one eighth of the excess among coded forms on the distance measure and about one thirtieth on look-alike pairs (comparing the excesses over expectation per pair). The four pairs are Bugis </w:t>
       </w:r>
       <w:r>
         <w:rPr>
@@ -9367,7 +9666,7 @@
         <w:pStyle w:val="OLtextindented"/>
       </w:pPr>
       <w:r>
-        <w:t>Shared vocabulary that ABVD's editors have recognised carries a cognate-set number and is by definition in the coded class, which this test does not examine; a shared layer beyond Proto-Malayo-Polynesian, if there were one, would sit there to the extent that the editors recognised it. Three of the four subgroups represented fall inside the proposed Celebic supergroup, so the four are not four independent witnesses. The paper therefore makes no claim about a shared pre-Austronesian layer, positive or negative, and it does not describe the uncoded forms as independent innovations either: the data show a small excess of similarity among uncoded forms of the same meaning, of a size far below that of the coded vocabulary, and nothing more. More than twenty p-values were computed in this and the preceding sections; of these, only the primary permutation test had its decision rule written before the run (Section 2.6).</w:t>
+        <w:t>Shared vocabulary that ABVD's editors have recognized carries a cognate-set number and is by definition in the coded class, which this test does not examine; a shared layer beyond Proto-Malayo-Polynesian, if there were one, would sit there to the extent that the editors recognized it. Three of the four subgroups represented fall inside the proposed Celebic supergroup, so the four are not four independent witnesses. The paper therefore makes no claim about a shared pre-Austronesian layer, positive or negative, and it does not describe the uncoded forms as independent innovations either: the data show a small excess of similarity among uncoded forms of the same meaning, of a size far below that of the coded vocabulary, and nothing more. More than twenty p-values were computed in this and the preceding sections; of these, only the primary permutation test had its decision rule written before the run (Section 2.6).</w:t>
       </w:r>
     </w:p>
     <w:p>
@@ -9405,7 +9704,7 @@
         <w:t>What the profile is.</w:t>
       </w:r>
       <w:r>
-        <w:t xml:space="preserve"> The measured content of Section 3.5 is a correlated bundle: uncoded forms in these six lists are about one character longer, more often carry a written glottal mark where the source writes one, and more often denote actions; the glottal mark and the action meaning hold at equal length, and the onset-string and nasal inputs do not separate from length. Everything beyond that is interpretation. The reading that the uncoded forms are morphologically complex citation forms is plausible, but it was not tested, and the rival reading that affixed forms are harder to code fits the same numbers. Loanwords are commonly adapted to the phonology of the borrowing language (Blust 2012:556, on Palauan); an uncoded form that looks like the coded vocabulary is therefore not thereby inherited, and deserves a specialist's attention as much as one that does not.</w:t>
+        <w:t xml:space="preserve"> The measured content of section 3.5 is a correlated bundle: uncoded forms in these six lists are about one character longer, more often carry a written glottal mark where the source writes one, and more often denote actions; the glottal mark and the action meaning hold at equal length, and the onset-string and nasal inputs do not separate from length. Everything beyond that is interpretation. The reading that the uncoded forms are morphologically complex citation forms is plausible, but it was not tested, and the rival reading that affixed forms are harder to code fits the same numbers. Loanwords are commonly adapted to the phonology of the borrowing language (Blust 2012:556, on Palauan); an uncoded form that looks like the coded vocabulary is therefore not thereby inherited, and deserves a specialist's attention as much as one that does not.</w:t>
       </w:r>
     </w:p>
     <w:p>
@@ -9433,7 +9732,7 @@
         <w:t>Makasar.</w:t>
       </w:r>
       <w:r>
-        <w:t xml:space="preserve"> The study adds to the discussion of Makasar's divergence a decomposition on a public database (in the PMP set, coded elsewhere, uncoded, with intervals) and a screen of the uncoded forms: Makasar has more uncoded meanings than Bugis and Sa'dan Toraja by 11 to 16 points, and only a small fraction of those forms resemble the PMP entry or the relatives' forms by a screen whose sensitivity even on coded forms is at most 38 percent. The counts are compatible with the lexical divergence reported by Mills (1975), Sirk (1989) and Bulbeck, Pasqua and Di Lello (2000); they do not prove it, since a spelling screen is not a cognate judgement, and they say nothing about its cause. What would decide the matter is a specialist's judgement of the 70 uncoded Makasar meanings against their Bugis and Sa'dan Toraja forms; the list is released for that purpose.</w:t>
+        <w:t xml:space="preserve"> The study adds to the discussion of Makasar's divergence a decomposition on a public database (in the PMP set, coded elsewhere, uncoded, with intervals) and a screen of the uncoded forms: Makasar has more uncoded meanings than Bugis and Sa'dan Toraja by 11 to 16 points, and only a small fraction of those forms resemble the PMP entry or the relatives' forms by a screen whose sensitivity even on coded forms is at most 38 percent. The counts are compatible with the lexical divergence reported by Mills (1975), Sirk (1989) and Bulbeck, Pasqua, and Di Lello (2000); they do not prove it, since a spelling screen is not a cognate judgment, and they say nothing about its cause. What would decide the matter is a specialist's judgment of the 70 uncoded Makasar meanings against their Bugis and Sa'dan Toraja forms; the list is released for that purpose.</w:t>
       </w:r>
     </w:p>
     <w:p>
@@ -9447,7 +9746,7 @@
         <w:t>Tolaki.</w:t>
       </w:r>
       <w:r>
-        <w:t xml:space="preserve"> The word under-documentation is withdrawn. The Tolaki list is well filled; it sits on the lower side of a thinly coded subgroup, and most of its uncoded forms have look-alikes elsewhere in Bungku-Tolaki. Seven of them match a coded Proto-Bungku-Tolaki entry by the screen, and twelve resemble the PMP entry. None of this bears on origin, for the reason given in Section 3.3.</w:t>
+        <w:t xml:space="preserve"> The word under-documentation is withdrawn. The Tolaki list is well filled; it sits on the lower side of a thinly coded subgroup, and most of its uncoded forms have look-alikes elsewhere in Bungku-Tolaki. Seven of them match a coded Proto-Bungku-Tolaki entry by the screen, and twelve resemble the PMP entry. None of this bears on origin, for the reason given in section 3.3.</w:t>
       </w:r>
     </w:p>
     <w:p>
@@ -9461,7 +9760,7 @@
         <w:t>Similarity across lists.</w:t>
       </w:r>
       <w:r>
-        <w:t xml:space="preserve"> Among uncoded forms, same-meaning forms are slightly more alike across lists than different-meaning forms. The excess is small, part of it may be shared affixation, and the coded class, where recognised shared vocabulary lives, was not examined. The paper has no cross-language claim.</w:t>
+        <w:t xml:space="preserve"> Among uncoded forms, same-meaning forms are slightly more alike across lists than different-meaning forms. The excess is small, part of it may be shared affixation, and the coded class, where recognized shared vocabulary lives, was not examined. The paper has no cross-language claim.</w:t>
       </w:r>
     </w:p>
     <w:p>
@@ -9475,7 +9774,7 @@
         <w:t>Limitations.</w:t>
       </w:r>
       <w:r>
-        <w:t xml:space="preserve"> The inputs are written forms, not phonemic transcriptions, and the lists differ in notation; the glottal mark is written routinely in four lists, in four forms of a fifth and not at all in the sixth, and whether that is notation or phonology is not known to us. No form was morphologically segmented, so the morphological reading of the profile is untested. The label is the state of cognate coding in one snapshot of one database; "coded" mixes inherited forms, small local sets and flagged loans, the coding rate differs between lists and subgroups, and one language has two lists that code each other. The properties of the profile are correlated, the intervals treat forms as independent although meanings recur across the six lists, and ten properties were tested without adjustment. Six lists from one island were used. The look-alike screen compares spellings, its 42 Bungku-Tolaki comparison lists represent 13 languages from two contributors, and its sensitivity is an upper bound. The analyses of Section 2.6 and the spelling tests had their decision rules written before they were run, on the same day and by the same analyst and without external registration; the further counts of Section 3.5 and the per-list figures were made after the results were known. Form inputs carry information about the source list even though no list-level input is used. And no single form has been assessed by a specialist in these languages.</w:t>
+        <w:t xml:space="preserve"> The inputs are written forms, not phonemic transcriptions, and the lists differ in notation; the glottal mark is written routinely in four lists, in four forms of a fifth and not at all in the sixth, and whether that is notation or phonology is not known to us. No form was morphologically segmented, so the morphological reading of the profile is untested. The label is the state of cognate coding in one snapshot of one database; "coded" mixes inherited forms, small local sets and flagged loans, the coding rate differs between lists and subgroups, and one language has two lists that code each other. The properties of the profile are correlated, the intervals treat forms as independent although meanings recur across the six lists, and ten properties were tested without adjustment. Six lists from one island were used. The look-alike screen compares spellings, its 42 Bungku-Tolaki comparison lists represent 13 languages from two contributors, and its sensitivity is an upper bound. The three-class count, the look-alike screens, the permutation test and the spelling tests had their decision rules written before they were run, on the same day and by the same analyst and without external registration; the further counts of section 3.5 and the per-list figures were made after the results were known. Form inputs carry information about the source list even though no list-level input is used. And no single form has been assessed by a specialist in these languages.</w:t>
       </w:r>
     </w:p>
     <w:p>
@@ -9491,7 +9790,7 @@
         <w:pStyle w:val="OLtext"/>
       </w:pPr>
       <w:r>
-        <w:t>Four things can be said. First, the uncoded forms of six Sulawesi ABVD lists can be ranked against the coded forms from their written shape and their meaning, with an AUC of about 0.73, but not reliably classified; the ranking carries over to a list the model has not seen. Second, the properties that distinguish them are a correlated bundle of length, a written glottal mark and an action meaning; the morphological reading of that bundle is untested. Third, for Makasar and for Tolaki the absence of a cognate-set number means different things, and in neither list does the absence of a number by itself indicate non-Austronesian origin: Makasar's uncoded forms are numerous and mostly unlike their relatives' forms by a mechanical screen; Tolaki's mostly have look-alikes elsewhere in its subgroup. A cognate-set number, equally, is not a finding of inheritance. Fourth, among uncoded forms the similarity across lists is small, and the test does not reach the class where a shared layer would be found. Three directions follow: morphological segmentation before any property is computed; cognate coding at the level of the subgroup, which would show how many of Tolaki's uncoded forms belong to sets with forms in related lists; and specialist inspection of the released lists, which is the only step that can establish etymologies. Conversion of the written forms to a phonetic transcription (Anderson et al. 2018) could reduce the dependence on notation that Section 3.6 measured.</w:t>
+        <w:t>Four things can be said. First, the uncoded forms of six Sulawesi ABVD lists can be ranked against the coded forms from their written shape and their meaning, with an AUC of about 0.73, but not reliably classified; the ranking carries over to a list the model has not seen. Second, the properties that distinguish them are a correlated bundle of length, a written glottal mark and an action meaning; the morphological reading of that bundle is untested. Third, for Makasar and for Tolaki the absence of a cognate-set number means different things, and in neither list does the absence of a number by itself indicate non-Austronesian origin: Makasar's uncoded forms are numerous and mostly unlike their relatives' forms by a mechanical screen; Tolaki's mostly have look-alikes elsewhere in its subgroup. A cognate-set number, equally, is not a finding of inheritance. Fourth, among uncoded forms the similarity across lists is small, and the test does not reach the class where a shared layer would be found. Three directions follow: morphological segmentation before any property is computed; cognate coding at the level of the subgroup, which would show how many of Tolaki's uncoded forms belong to sets with forms in related lists; and specialist inspection of the released lists, which is the only step that can establish etymologies. Conversion of the written forms to a phonetic transcription (Anderson et al. 2018) could reduce the dependence on notation that section 3.6 measured.</w:t>
       </w:r>
     </w:p>
     <w:p>
@@ -9507,7 +9806,7 @@
         <w:pStyle w:val="OLtext"/>
       </w:pPr>
       <w:r>
-        <w:t>The two data files described in the text are deposited at Zenodo (https://doi.org/10.5281/zenodo.23202245; licence CC BY 4.0): one row for each of the 1,357 forms (ABVD identifiers, the form as recorded, cognate-set numbers and loan flag, the label, the out-of-sample scores of the full model, of a variant with the list-identity input that Section 2.3 withdrew, and of the held-out-list model, the cell of Table 6, and the nearest same-meaning look-alike in other Sulawesi lists and, for Tolaki, in Bungku-Tolaki lists); the 438 uncoded forms as a subset; the 70 uncoded Makasar meanings with the Bugis and Sa'dan Toraja forms and the PMP entry; the twelve Tolaki look-alikes of PMP entries; and the 92 example rows from which Table 7 was drawn. The source data are ABVD (Greenhill, Blust and Gray 2008), lexibank/abvd at repository state 917c5a5, CC BY 4.0. The analysis scripts, the pre-stated decision rules and the result files are in the public project repository (https://github.com/neimasilk/volcarch-repo, folders experiments/E227 to E231; MIT licence).</w:t>
+        <w:t>The data files described below are deposited at Zenodo (https://doi.org/10.5281/zenodo.23202245; license CC BY 4.0): one row for each of the 1,357 forms (ABVD identifiers, the form as recorded, cognate-set numbers and loan flag, the label, the out-of-sample scores of the full model, of a variant with the list-identity input that section 2.3 withdrew, and of the held-out-list model, the cell of table 6, and the nearest same-meaning look-alike in other Sulawesi lists and, for Tolaki, in Bungku-Tolaki lists); the 438 uncoded forms as a subset; the 70 uncoded Makasar meanings with the Bugis and Sa'dan Toraja forms and the PMP entry; the twelve Tolaki look-alikes of PMP entries; and the 92 example rows from which table 7 was drawn. The source data are ABVD (Greenhill, Blust, and Gray 2008), lexibank/abvd at repository state 917c5a5, CC BY 4.0. The analysis scripts, the pre-stated decision rules and the result files are in the public project repository (https://github.com/neimasilk/volcarch-repo, folders experiments/E227 to E231; MIT license).</w:t>
       </w:r>
     </w:p>
     <w:p>
@@ -9523,7 +9822,7 @@
         <w:pStyle w:val="OLtext"/>
       </w:pPr>
       <w:r>
-        <w:t>This study was carried out with AI assistance (Claude, Anthropic) at every stage: the scripts for feature extraction, classification, the look-alike screen and the permutation test; the re-derivation of every number of an earlier version of this paper from the raw files, which found the errors acknowledged in the text; the analyses added for the revision; the tables; the locating and reading of the sources cited; and the drafting of the text. The authors set the questions and the rules of the study, approved the design choices and the withdrawal of the earlier claims, reviewed the text, and take responsibility for every statement. No statement in this paper rests on an etymological judgement, by an AI system or by the authors; the remark on the decimal numerals in Section 3.5 is an observation about transparent compounds. The authors are not specialists in the languages discussed; the methods of Section 2 are their substitute for judgements they cannot make, and the limits of that substitute are stated where each result is given.</w:t>
+        <w:t>This study was carried out with artificial intelligence (AI) assistance (Claude, Anthropic) at every stage: the scripts for feature extraction, classification, the look-alike screen and the permutation test; the re-derivation of every number of an earlier version of this paper from the raw files, which found the errors acknowledged in the text; the analyses added for the revision; the tables; the locating and reading of the sources cited; and the drafting of the text. The authors set the questions and the rules of the study, approved the design choices and the withdrawal of the earlier claims, reviewed the text, and take responsibility for every statement. No statement in this paper rests on an etymological judgment, by an AI system or by the authors; the remark on the decimal numerals in section 3.5 is an observation about transparent compounds. The authors are not specialists in the languages discussed; the methods of section 2 are their substitute for judgments they cannot make, and the limits of that substitute are stated where each result is given.</w:t>
       </w:r>
     </w:p>
     <w:p>
@@ -9548,7 +9847,7 @@
         <w:t>Oceanic Linguistics</w:t>
       </w:r>
       <w:r>
-        <w:t>, whose questions prompted part of the re-derivation reported here, and the editors for their patience. We thank the compilers of the ABVD word lists and the ABVD team for making the data available under an open licence.</w:t>
+        <w:t>, whose questions prompted part of the re-derivation reported here, and the editors for their patience. We thank the compilers of the ABVD word lists and the ABVD team for making the data available under an open license.</w:t>
       </w:r>
     </w:p>
     <w:p>
@@ -9564,7 +9863,7 @@
         <w:pStyle w:val="OLreferencelist"/>
       </w:pPr>
       <w:r>
-        <w:t>Anderson, Cormac, Tiago Tresoldi, Thiago Costa Chacon, Anne-Maria Fehn, Mary Walworth, Robert Forkel &amp; Johann-Mattis List. 2018. A cross-linguistic database of phonetic transcription systems. Yearbook of the Poznan Linguistic Meeting 4(1). 21–53. https://doi.org/10.2478/yplm-2018-0002.</w:t>
+        <w:t>Anderson, Cormac, Tiago Tresoldi, Thiago Costa Chacon, Anne-Maria Fehn, Mary Walworth, Robert Forkel and Johann-Mattis List. 2018. A cross-linguistic database of phonetic transcription systems. Yearbook of the Poznan Linguistic Meeting 4(1). 21–53. https://doi.org/10.2478/yplm-2018-0002.</w:t>
       </w:r>
     </w:p>
     <w:p>
@@ -9596,7 +9895,7 @@
         <w:pStyle w:val="OLreferencelist"/>
       </w:pPr>
       <w:r>
-        <w:t>Blust, Robert. 2013. The Austronesian languages. revised. Canberra: Asia-Pacific Linguistics.</w:t>
+        <w:t>Blust, Robert. 2013. The Austronesian languages. Revised edition. Canberra: Asia-Pacific Linguistics.</w:t>
       </w:r>
     </w:p>
     <w:p>
@@ -9612,7 +9911,7 @@
         <w:pStyle w:val="OLreferencelist"/>
       </w:pPr>
       <w:r>
-        <w:t>Bulbeck, David, Monique Pasqua &amp; Adrian Di Lello. 2000. Culture history of the Toalean of South Sulawesi, Indonesia. Asian Perspectives 39(1–2). 71–108. https://doi.org/10.1353/asi.2000.0004.</w:t>
+        <w:t>Bulbeck, David, Monique Pasqua and Adrian Di Lello. 2000. Culture history of the Toalean of South Sulawesi, Indonesia. Asian Perspectives 39(1–2). 71–108. https://doi.org/10.1353/asi.2000.0004.</w:t>
       </w:r>
     </w:p>
     <w:p>
@@ -9628,7 +9927,7 @@
         <w:pStyle w:val="OLreferencelist"/>
       </w:pPr>
       <w:r>
-        <w:t>Chen, Tianqi &amp; Carlos Guestrin. 2016. XGBoost: A scalable tree boosting system. In Proceedings of the 22nd ACM SIGKDD international conference on knowledge discovery and data mining, 785–794. https://doi.org/10.1145/2939672.2939785.</w:t>
+        <w:t>Chen, Tianqi and Carlos Guestrin. 2016. XGBoost: A scalable tree boosting system. In Proceedings of the 22nd ACM SIGKDD international conference on knowledge discovery and data mining, 785–794. https://doi.org/10.1145/2939672.2939785.</w:t>
       </w:r>
     </w:p>
     <w:p>
@@ -9644,7 +9943,7 @@
         <w:pStyle w:val="OLreferencelist"/>
       </w:pPr>
       <w:r>
-        <w:t>Forkel, Robert, Johann-Mattis List, Simon J. Greenhill, Christoph Rzymski, Sebastian Bank, Michael Cysouw, Harald Hammarström, Martin Haspelmath, Gereon A. Kaiping &amp; Russell D. Gray. 2018. Cross-Linguistic Data Formats, advancing data sharing and re-use in comparative linguistics. Scientific Data 5. 180205. https://doi.org/10.1038/sdata.2018.205.</w:t>
+        <w:t>Forkel, Robert, Johann-Mattis List, Simon J. Greenhill, Christoph Rzymski, Sebastian Bank, Michael Cysouw, Harald Hammarström, Martin Haspelmath, Gereon A. Kaiping and Russell D. Gray. 2018. Cross-Linguistic Data Formats, advancing data sharing and re-use in comparative linguistics. Scientific Data 5. 180205. https://doi.org/10.1038/sdata.2018.205.</w:t>
       </w:r>
     </w:p>
     <w:p>
@@ -9652,7 +9951,7 @@
         <w:pStyle w:val="OLreferencelist"/>
       </w:pPr>
       <w:r>
-        <w:t>Gray, Russell D., Alexei J. Drummond &amp; Simon J. Greenhill. 2009. Language phylogenies reveal expansion pulses and pauses in Pacific settlement. Science 323(5913). 479–483. https://doi.org/10.1126/science.1166858.</w:t>
+        <w:t>Gray, Russell D., Alexei J. Drummond and Simon J. Greenhill. 2009. Language phylogenies reveal expansion pulses and pauses in Pacific settlement. Science 323(5913). 479–483. https://doi.org/10.1126/science.1166858.</w:t>
       </w:r>
     </w:p>
     <w:p>
@@ -9660,7 +9959,7 @@
         <w:pStyle w:val="OLreferencelist"/>
       </w:pPr>
       <w:r>
-        <w:t>Greenhill, Simon J., Robert Blust &amp; Russell D. Gray. 2008. The Austronesian Basic Vocabulary Database: From bioinformatics to lexomics. Evolutionary Bioinformatics 4. 271–283. https://doi.org/10.4137/EBO.S893.</w:t>
+        <w:t>Greenhill, Simon J., Robert Blust and Russell D. Gray. 2008. The Austronesian Basic Vocabulary Database: From bioinformatics to lexomics. Evolutionary Bioinformatics 4. 271–283. https://doi.org/10.4137/EBO.S893.</w:t>
       </w:r>
     </w:p>
     <w:p>
@@ -9676,7 +9975,7 @@
         <w:pStyle w:val="OLreferencelist"/>
       </w:pPr>
       <w:r>
-        <w:t>List, Johann-Mattis. 2012. LexStat: Automatic detection of cognates in multilingual wordlists. In Proceedings of the EACL 2012 joint workshop of LINGVIS &amp; UNCLH, 117–125. Avignon, France: Association for Computational Linguistics.</w:t>
+        <w:t>List, Johann-Mattis. 2012. LexStat: Automatic detection of cognates in multilingual wordlists. In Proceedings of the EACL 2012 joint workshop of LINGVIS and UNCLH, 117–125. Avignon, France: Association for Computational Linguistics.</w:t>
       </w:r>
     </w:p>
     <w:p>
@@ -9684,7 +9983,7 @@
         <w:pStyle w:val="OLreferencelist"/>
       </w:pPr>
       <w:r>
-        <w:t>Lundberg, Scott M. &amp; Su-In Lee. 2017. A unified approach to interpreting model predictions. In Advances in neural information processing systems 30, 4765–4774.</w:t>
+        <w:t>Lundberg, Scott M. and Su-In Lee. 2017. A unified approach to interpreting model predictions. In Advances in neural information processing systems 30, 4765–4774.</w:t>
       </w:r>
     </w:p>
     <w:p>
@@ -9748,13 +10047,14 @@
         <w:pStyle w:val="OLreferencelist"/>
       </w:pPr>
       <w:r>
-        <w:t>White, Nicole, Rex Parsons, Gary Collins &amp; Adrian Barnett. 2023. Evidence of questionable research practices in clinical prediction models. BMC Medicine 21. 339. https://doi.org/10.1186/s12916-023-03048-6.</w:t>
+        <w:t>White, Nicole, Rex Parsons, Gary Collins and Adrian Barnett. 2023. Evidence of questionable research practices in clinical prediction models. BMC Medicine 21. 339. https://doi.org/10.1186/s12916-023-03048-6.</w:t>
       </w:r>
     </w:p>
     <w:sectPr>
       <w:headerReference w:type="even" r:id="rId8"/>
       <w:headerReference w:type="default" r:id="rId9"/>
       <w:footerReference w:type="first" r:id="rId10"/>
+      <w:headerReference w:type="first" r:id="rId13"/>
       <w:type w:val="continuous"/>
       <w:pgSz w:w="8640" w:h="12960" w:code="9"/>
       <w:pgMar w:top="1320" w:right="1080" w:bottom="1030" w:left="1320" w:header="856" w:footer="720" w:gutter="0"/>
@@ -10214,7 +10514,7 @@
           <w:ptab w:relativeTo="margin" w:alignment="left" w:leader="none"/>
         </w:r>
         <w:r>
-          <w:t>oceanic linguistics template</w:t>
+          <w:t>Uncoded basic vocabulary in six Sulawesi word lists</w:t>
         </w:r>
         <w:r>
           <w:ptab w:relativeTo="margin" w:alignment="right" w:leader="none"/>
@@ -10253,6 +10553,16 @@
       </w:p>
     </w:sdtContent>
   </w:sdt>
+</w:hdr>
+</file>
+
+<file path=word/header3.xml><?xml version="1.0" encoding="utf-8"?>
+<w:hdr xmlns:m="http://schemas.openxmlformats.org/officeDocument/2006/math" xmlns:mc="http://schemas.openxmlformats.org/markup-compatibility/2006" xmlns:mo="http://schemas.microsoft.com/office/mac/office/2008/main" xmlns:mv="urn:schemas-microsoft-com:mac:vml" xmlns:o="urn:schemas-microsoft-com:office:office" xmlns:r="http://schemas.openxmlformats.org/officeDocument/2006/relationships" xmlns:v="urn:schemas-microsoft-com:vml" xmlns:w10="urn:schemas-microsoft-com:office:word" xmlns:w14="http://schemas.microsoft.com/office/word/2010/wordml" xmlns:w="http://schemas.openxmlformats.org/wordprocessingml/2006/main" xmlns:wne="http://schemas.microsoft.com/office/word/2006/wordml" xmlns:wp14="http://schemas.microsoft.com/office/word/2010/wordprocessingDrawing" xmlns:wp="http://schemas.openxmlformats.org/drawingml/2006/wordprocessingDrawing" xmlns:wpc="http://schemas.microsoft.com/office/word/2010/wordprocessingCanvas" xmlns:wpg="http://schemas.microsoft.com/office/word/2010/wordprocessingGroup" xmlns:wpi="http://schemas.microsoft.com/office/word/2010/wordprocessingInk" xmlns:wps="http://schemas.microsoft.com/office/word/2010/wordprocessingShape" mc:Ignorable="w14 wp14">
+  <w:p>
+    <w:pPr>
+      <w:pStyle w:val="Header"/>
+    </w:pPr>
+  </w:p>
 </w:hdr>
 </file>
 

</xml_diff>